<commit_message>
CN-A3: added the sample outputs
</commit_message>
<xml_diff>
--- a/comp-networks-sem4/assignment-3/CN-A3-Report.docx
+++ b/comp-networks-sem4/assignment-3/CN-A3-Report.docx
@@ -891,24 +891,12 @@
       <w:r>
         <w:t xml:space="preserve"> Link: </w:t>
       </w:r>
-      <w:hyperlink r:id="rId9" w:history="1">
+      <w:hyperlink r:id="rId9" w:anchor="json=6-a65NpNRoWeB_X4J1Jf2,jCcrx1C3z6myb0ysQDcY-Q" w:history="1">
         <w:r>
           <w:rPr>
             <w:rStyle w:val="Hyperlink"/>
           </w:rPr>
-          <w:t>https://excalidraw.com/#json=6-a65NpNRoWeB_X</w:t>
-        </w:r>
-        <w:r>
-          <w:rPr>
-            <w:rStyle w:val="Hyperlink"/>
-          </w:rPr>
-          <w:t>4</w:t>
-        </w:r>
-        <w:r>
-          <w:rPr>
-            <w:rStyle w:val="Hyperlink"/>
-          </w:rPr>
-          <w:t>J1Jf2,jCcrx1C3z6myb0ysQDcY-Q</w:t>
+          <w:t>https://excalidraw.com/#json=6-a65NpNRoWeB_X4J1Jf2,jCcrx1C3z6myb0ysQDcY-Q</w:t>
         </w:r>
       </w:hyperlink>
     </w:p>
@@ -922,6 +910,9 @@
         <w:spacing w:after="80"/>
       </w:pPr>
       <w:r>
+        <w:rPr>
+          <w:noProof/>
+        </w:rPr>
         <w:drawing>
           <wp:inline distT="0" distB="0" distL="0" distR="0" wp14:anchorId="1649DF8C" wp14:editId="0C30FBBC">
             <wp:extent cx="5943600" cy="2487930"/>
@@ -964,6 +955,9 @@
         <w:spacing w:after="80"/>
       </w:pPr>
       <w:r>
+        <w:rPr>
+          <w:noProof/>
+        </w:rPr>
         <w:lastRenderedPageBreak/>
         <w:drawing>
           <wp:inline distT="0" distB="0" distL="0" distR="0" wp14:anchorId="03730CF5" wp14:editId="6813CFFA">
@@ -1007,6 +1001,9 @@
         <w:spacing w:after="80"/>
       </w:pPr>
       <w:r>
+        <w:rPr>
+          <w:noProof/>
+        </w:rPr>
         <w:drawing>
           <wp:inline distT="0" distB="0" distL="0" distR="0" wp14:anchorId="79A0B59A" wp14:editId="5DD95C86">
             <wp:extent cx="5943600" cy="2569845"/>
@@ -1972,6 +1969,165 @@
       <w:pPr>
         <w:spacing w:after="100" w:line="276" w:lineRule="auto"/>
       </w:pPr>
+      <w:r>
+        <w:drawing>
+          <wp:inline distT="0" distB="0" distL="0" distR="0" wp14:anchorId="2CBE516E" wp14:editId="3B3DAF02">
+            <wp:extent cx="5943600" cy="2818130"/>
+            <wp:effectExtent l="0" t="0" r="0" b="1270"/>
+            <wp:docPr id="3" name="Picture 3"/>
+            <wp:cNvGraphicFramePr>
+              <a:graphicFrameLocks xmlns:a="http://schemas.openxmlformats.org/drawingml/2006/main" noChangeAspect="1"/>
+            </wp:cNvGraphicFramePr>
+            <a:graphic xmlns:a="http://schemas.openxmlformats.org/drawingml/2006/main">
+              <a:graphicData uri="http://schemas.openxmlformats.org/drawingml/2006/picture">
+                <pic:pic xmlns:pic="http://schemas.openxmlformats.org/drawingml/2006/picture">
+                  <pic:nvPicPr>
+                    <pic:cNvPr id="0" name=""/>
+                    <pic:cNvPicPr/>
+                  </pic:nvPicPr>
+                  <pic:blipFill>
+                    <a:blip r:embed="rId13"/>
+                    <a:stretch>
+                      <a:fillRect/>
+                    </a:stretch>
+                  </pic:blipFill>
+                  <pic:spPr>
+                    <a:xfrm>
+                      <a:off x="0" y="0"/>
+                      <a:ext cx="5943600" cy="2818130"/>
+                    </a:xfrm>
+                    <a:prstGeom prst="rect">
+                      <a:avLst/>
+                    </a:prstGeom>
+                  </pic:spPr>
+                </pic:pic>
+              </a:graphicData>
+            </a:graphic>
+          </wp:inline>
+        </w:drawing>
+      </w:r>
+    </w:p>
+    <w:p>
+      <w:pPr>
+        <w:spacing w:after="100" w:line="276" w:lineRule="auto"/>
+      </w:pPr>
+      <w:r>
+        <w:lastRenderedPageBreak/>
+        <w:drawing>
+          <wp:inline distT="0" distB="0" distL="0" distR="0" wp14:anchorId="5D0100D5" wp14:editId="61C76DDE">
+            <wp:extent cx="3181322" cy="1653540"/>
+            <wp:effectExtent l="0" t="0" r="635" b="3810"/>
+            <wp:docPr id="4" name="Picture 4"/>
+            <wp:cNvGraphicFramePr>
+              <a:graphicFrameLocks xmlns:a="http://schemas.openxmlformats.org/drawingml/2006/main" noChangeAspect="1"/>
+            </wp:cNvGraphicFramePr>
+            <a:graphic xmlns:a="http://schemas.openxmlformats.org/drawingml/2006/main">
+              <a:graphicData uri="http://schemas.openxmlformats.org/drawingml/2006/picture">
+                <pic:pic xmlns:pic="http://schemas.openxmlformats.org/drawingml/2006/picture">
+                  <pic:nvPicPr>
+                    <pic:cNvPr id="0" name=""/>
+                    <pic:cNvPicPr/>
+                  </pic:nvPicPr>
+                  <pic:blipFill>
+                    <a:blip r:embed="rId14"/>
+                    <a:stretch>
+                      <a:fillRect/>
+                    </a:stretch>
+                  </pic:blipFill>
+                  <pic:spPr>
+                    <a:xfrm>
+                      <a:off x="0" y="0"/>
+                      <a:ext cx="3184595" cy="1655241"/>
+                    </a:xfrm>
+                    <a:prstGeom prst="rect">
+                      <a:avLst/>
+                    </a:prstGeom>
+                  </pic:spPr>
+                </pic:pic>
+              </a:graphicData>
+            </a:graphic>
+          </wp:inline>
+        </w:drawing>
+      </w:r>
+    </w:p>
+    <w:p>
+      <w:pPr>
+        <w:spacing w:after="100" w:line="276" w:lineRule="auto"/>
+      </w:pPr>
+      <w:r>
+        <w:drawing>
+          <wp:inline distT="0" distB="0" distL="0" distR="0" wp14:anchorId="172F27FD" wp14:editId="071DD354">
+            <wp:extent cx="3070860" cy="2887062"/>
+            <wp:effectExtent l="0" t="0" r="0" b="8890"/>
+            <wp:docPr id="9" name="Picture 9"/>
+            <wp:cNvGraphicFramePr>
+              <a:graphicFrameLocks xmlns:a="http://schemas.openxmlformats.org/drawingml/2006/main" noChangeAspect="1"/>
+            </wp:cNvGraphicFramePr>
+            <a:graphic xmlns:a="http://schemas.openxmlformats.org/drawingml/2006/main">
+              <a:graphicData uri="http://schemas.openxmlformats.org/drawingml/2006/picture">
+                <pic:pic xmlns:pic="http://schemas.openxmlformats.org/drawingml/2006/picture">
+                  <pic:nvPicPr>
+                    <pic:cNvPr id="0" name=""/>
+                    <pic:cNvPicPr/>
+                  </pic:nvPicPr>
+                  <pic:blipFill>
+                    <a:blip r:embed="rId15"/>
+                    <a:stretch>
+                      <a:fillRect/>
+                    </a:stretch>
+                  </pic:blipFill>
+                  <pic:spPr>
+                    <a:xfrm>
+                      <a:off x="0" y="0"/>
+                      <a:ext cx="3071837" cy="2887980"/>
+                    </a:xfrm>
+                    <a:prstGeom prst="rect">
+                      <a:avLst/>
+                    </a:prstGeom>
+                  </pic:spPr>
+                </pic:pic>
+              </a:graphicData>
+            </a:graphic>
+          </wp:inline>
+        </w:drawing>
+      </w:r>
+      <w:r>
+        <w:drawing>
+          <wp:inline distT="0" distB="0" distL="0" distR="0" wp14:anchorId="69EF3330" wp14:editId="188BB160">
+            <wp:extent cx="3009900" cy="2903220"/>
+            <wp:effectExtent l="0" t="0" r="0" b="0"/>
+            <wp:docPr id="8" name="Picture 8"/>
+            <wp:cNvGraphicFramePr>
+              <a:graphicFrameLocks xmlns:a="http://schemas.openxmlformats.org/drawingml/2006/main" noChangeAspect="1"/>
+            </wp:cNvGraphicFramePr>
+            <a:graphic xmlns:a="http://schemas.openxmlformats.org/drawingml/2006/main">
+              <a:graphicData uri="http://schemas.openxmlformats.org/drawingml/2006/picture">
+                <pic:pic xmlns:pic="http://schemas.openxmlformats.org/drawingml/2006/picture">
+                  <pic:nvPicPr>
+                    <pic:cNvPr id="0" name=""/>
+                    <pic:cNvPicPr/>
+                  </pic:nvPicPr>
+                  <pic:blipFill>
+                    <a:blip r:embed="rId16"/>
+                    <a:stretch>
+                      <a:fillRect/>
+                    </a:stretch>
+                  </pic:blipFill>
+                  <pic:spPr>
+                    <a:xfrm>
+                      <a:off x="0" y="0"/>
+                      <a:ext cx="3016866" cy="2909939"/>
+                    </a:xfrm>
+                    <a:prstGeom prst="rect">
+                      <a:avLst/>
+                    </a:prstGeom>
+                  </pic:spPr>
+                </pic:pic>
+              </a:graphicData>
+            </a:graphic>
+          </wp:inline>
+        </w:drawing>
+      </w:r>
       <w:bookmarkStart w:id="0" w:name="_GoBack"/>
       <w:bookmarkEnd w:id="0"/>
     </w:p>
@@ -4338,7 +4494,7 @@
 </file>
 
 <file path=customXml/itemProps1.xml><?xml version="1.0" encoding="utf-8"?>
-<ds:datastoreItem xmlns:ds="http://schemas.openxmlformats.org/officeDocument/2006/customXml" ds:itemID="{76FEB1CE-8996-47FB-9981-329C41DD28F2}">
+<ds:datastoreItem xmlns:ds="http://schemas.openxmlformats.org/officeDocument/2006/customXml" ds:itemID="{9CAA145A-0125-4503-96DD-3EF9647E2769}">
   <ds:schemaRefs>
     <ds:schemaRef ds:uri="http://schemas.openxmlformats.org/officeDocument/2006/bibliography"/>
   </ds:schemaRefs>

</xml_diff>